<commit_message>
add Justin work, show working on EH&B
</commit_message>
<xml_diff>
--- a/Decisions/EH&B/Kyle's Thoughts.docx
+++ b/Decisions/EH&B/Kyle's Thoughts.docx
@@ -3,73 +3,125 @@
 <w:document xmlns:wpc="http://schemas.microsoft.com/office/word/2010/wordprocessingCanvas" xmlns:cx="http://schemas.microsoft.com/office/drawing/2014/chartex" xmlns:cx1="http://schemas.microsoft.com/office/drawing/2015/9/8/chartex" xmlns:cx2="http://schemas.microsoft.com/office/drawing/2015/10/21/chartex" xmlns:cx3="http://schemas.microsoft.com/office/drawing/2016/5/9/chartex" xmlns:cx4="http://schemas.microsoft.com/office/drawing/2016/5/10/chartex" xmlns:cx5="http://schemas.microsoft.com/office/drawing/2016/5/11/chartex" xmlns:cx6="http://schemas.microsoft.com/office/drawing/2016/5/12/chartex" xmlns:cx7="http://schemas.microsoft.com/office/drawing/2016/5/13/chartex" xmlns:cx8="http://schemas.microsoft.com/office/drawing/2016/5/14/chartex" xmlns:mc="http://schemas.openxmlformats.org/markup-compatibility/2006" xmlns:aink="http://schemas.microsoft.com/office/drawing/2016/ink" xmlns:am3d="http://schemas.microsoft.com/office/drawing/2017/model3d" xmlns:o="urn:schemas-microsoft-com:office:office" xmlns:oel="http://schemas.microsoft.com/office/2019/extlst" xmlns:r="http://schemas.openxmlformats.org/officeDocument/2006/relationships" xmlns:m="http://schemas.openxmlformats.org/officeDocument/2006/math" xmlns:v="urn:schemas-microsoft-com:vml" xmlns:wp14="http://schemas.microsoft.com/office/word/2010/wordprocessingDrawing" xmlns:wp="http://schemas.openxmlformats.org/drawingml/2006/wordprocessingDrawing" xmlns:w10="urn:schemas-microsoft-com:office:word" xmlns:w="http://schemas.openxmlformats.org/wordprocessingml/2006/main" xmlns:w14="http://schemas.microsoft.com/office/word/2010/wordml" xmlns:w15="http://schemas.microsoft.com/office/word/2012/wordml" xmlns:w16cex="http://schemas.microsoft.com/office/word/2018/wordml/cex" xmlns:w16cid="http://schemas.microsoft.com/office/word/2016/wordml/cid" xmlns:w16="http://schemas.microsoft.com/office/word/2018/wordml" xmlns:w16du="http://schemas.microsoft.com/office/word/2023/wordml/word16du" xmlns:w16sdtdh="http://schemas.microsoft.com/office/word/2020/wordml/sdtdatahash" xmlns:w16sdtfl="http://schemas.microsoft.com/office/word/2024/wordml/sdtformatlock" xmlns:w16se="http://schemas.microsoft.com/office/word/2015/wordml/symex" xmlns:wpg="http://schemas.microsoft.com/office/word/2010/wordprocessingGroup" xmlns:wpi="http://schemas.microsoft.com/office/word/2010/wordprocessingInk" xmlns:wne="http://schemas.microsoft.com/office/word/2006/wordml" xmlns:wps="http://schemas.microsoft.com/office/word/2010/wordprocessingShape" mc:Ignorable="w14 w15 w16se w16cid w16 w16cex w16sdtdh w16sdtfl w16du wp14">
   <w:body>
     <w:p>
-      <w:r>
+      <w:pPr>
+        <w:rPr>
+          <w:rFonts w:ascii="Georgia" w:hAnsi="Georgia"/>
+        </w:rPr>
+      </w:pPr>
+      <w:r>
+        <w:rPr>
+          <w:rFonts w:ascii="Georgia" w:hAnsi="Georgia"/>
+        </w:rPr>
         <w:t xml:space="preserve">Insurance brokerage firms reframed </w:t>
       </w:r>
       <w:r>
         <w:rPr>
+          <w:rFonts w:ascii="Georgia" w:hAnsi="Georgia"/>
           <w:b/>
           <w:bCs/>
         </w:rPr>
         <w:t>Employee Health &amp; Benefits (EH&amp;B)</w:t>
       </w:r>
       <w:r>
+        <w:rPr>
+          <w:rFonts w:ascii="Georgia" w:hAnsi="Georgia"/>
+        </w:rPr>
         <w:t xml:space="preserve"> from a necessary expense into a strategic investment in workforce productivity.</w:t>
       </w:r>
     </w:p>
     <w:p>
-      <w:r>
+      <w:pPr>
+        <w:rPr>
+          <w:rFonts w:ascii="Georgia" w:hAnsi="Georgia"/>
+        </w:rPr>
+      </w:pPr>
+      <w:r>
+        <w:rPr>
+          <w:rFonts w:ascii="Georgia" w:hAnsi="Georgia"/>
+        </w:rPr>
         <w:t xml:space="preserve">Instead of focusing only on premiums and coverage, they emphasized how well-designed benefits could </w:t>
       </w:r>
       <w:r>
         <w:rPr>
+          <w:rFonts w:ascii="Georgia" w:hAnsi="Georgia"/>
           <w:b/>
           <w:bCs/>
         </w:rPr>
         <w:t>reduce absenteeism and presenteeism</w:t>
       </w:r>
       <w:r>
+        <w:rPr>
+          <w:rFonts w:ascii="Georgia" w:hAnsi="Georgia"/>
+        </w:rPr>
         <w:t>—being at work but not fully productive—while improving employee engagement and retention. They positioned preventive care, mental-health support, and wellness programs as tools for achieving those outcomes.</w:t>
       </w:r>
     </w:p>
     <w:p>
-      <w:r>
+      <w:pPr>
+        <w:rPr>
+          <w:rFonts w:ascii="Georgia" w:hAnsi="Georgia"/>
+        </w:rPr>
+      </w:pPr>
+      <w:r>
+        <w:rPr>
+          <w:rFonts w:ascii="Georgia" w:hAnsi="Georgia"/>
+        </w:rPr>
         <w:t xml:space="preserve">By using workforce and claims data to connect health needs with business performance, brokers shifted the conversation from </w:t>
       </w:r>
       <w:r>
         <w:rPr>
+          <w:rFonts w:ascii="Georgia" w:hAnsi="Georgia"/>
           <w:b/>
           <w:bCs/>
         </w:rPr>
         <w:t>“How much do benefits cost?” to “How can benefits help employees—and the company—perform better?”</w:t>
       </w:r>
     </w:p>
-    <w:p/>
-    <w:p>
-      <w:r>
-        <w:t>T</w:t>
-      </w:r>
-      <w:r>
-        <w:t xml:space="preserve">he shift broadly began in the </w:t>
-      </w:r>
-      <w:r>
-        <w:rPr>
+    <w:p>
+      <w:pPr>
+        <w:rPr>
+          <w:rFonts w:ascii="Georgia" w:hAnsi="Georgia"/>
+        </w:rPr>
+      </w:pPr>
+    </w:p>
+    <w:p>
+      <w:pPr>
+        <w:rPr>
+          <w:rFonts w:ascii="Georgia" w:hAnsi="Georgia"/>
+        </w:rPr>
+      </w:pPr>
+      <w:r>
+        <w:rPr>
+          <w:rFonts w:ascii="Georgia" w:hAnsi="Georgia"/>
+        </w:rPr>
+        <w:t xml:space="preserve">The shift broadly began in the </w:t>
+      </w:r>
+      <w:r>
+        <w:rPr>
+          <w:rFonts w:ascii="Georgia" w:hAnsi="Georgia"/>
           <w:b/>
           <w:bCs/>
         </w:rPr>
         <w:t>late 1990s and early 2000s</w:t>
       </w:r>
       <w:r>
+        <w:rPr>
+          <w:rFonts w:ascii="Georgia" w:hAnsi="Georgia"/>
+        </w:rPr>
         <w:t xml:space="preserve"> and became more prominent in the </w:t>
       </w:r>
       <w:r>
         <w:rPr>
+          <w:rFonts w:ascii="Georgia" w:hAnsi="Georgia"/>
           <w:b/>
           <w:bCs/>
         </w:rPr>
         <w:t>2010s</w:t>
       </w:r>
       <w:r>
+        <w:rPr>
+          <w:rFonts w:ascii="Georgia" w:hAnsi="Georgia"/>
+        </w:rPr>
         <w:t>.</w:t>
       </w:r>
     </w:p>
@@ -79,15 +131,22 @@
           <w:ilvl w:val="0"/>
           <w:numId w:val="1"/>
         </w:numPr>
-      </w:pPr>
-      <w:r>
-        <w:rPr>
+        <w:rPr>
+          <w:rFonts w:ascii="Georgia" w:hAnsi="Georgia"/>
+        </w:rPr>
+      </w:pPr>
+      <w:r>
+        <w:rPr>
+          <w:rFonts w:ascii="Georgia" w:hAnsi="Georgia"/>
           <w:b/>
           <w:bCs/>
         </w:rPr>
         <w:t>Late 1990s–early 2000s:</w:t>
       </w:r>
       <w:r>
+        <w:rPr>
+          <w:rFonts w:ascii="Georgia" w:hAnsi="Georgia"/>
+        </w:rPr>
         <w:t xml:space="preserve"> Benefits advisers increasingly connected employee health to absenteeism, disability costs, and lost productivity—not just insurance spending.</w:t>
       </w:r>
     </w:p>
@@ -97,15 +156,22 @@
           <w:ilvl w:val="0"/>
           <w:numId w:val="1"/>
         </w:numPr>
-      </w:pPr>
-      <w:r>
-        <w:rPr>
+        <w:rPr>
+          <w:rFonts w:ascii="Georgia" w:hAnsi="Georgia"/>
+        </w:rPr>
+      </w:pPr>
+      <w:r>
+        <w:rPr>
+          <w:rFonts w:ascii="Georgia" w:hAnsi="Georgia"/>
           <w:b/>
           <w:bCs/>
         </w:rPr>
         <w:t>Mid-to-late 2000s:</w:t>
       </w:r>
       <w:r>
+        <w:rPr>
+          <w:rFonts w:ascii="Georgia" w:hAnsi="Georgia"/>
+        </w:rPr>
         <w:t xml:space="preserve"> Wellness programs, disease management, and health-data analytics strengthened the case for treating benefits as an investment in workforce performance.</w:t>
       </w:r>
     </w:p>
@@ -115,15 +181,22 @@
           <w:ilvl w:val="0"/>
           <w:numId w:val="1"/>
         </w:numPr>
-      </w:pPr>
-      <w:r>
-        <w:rPr>
+        <w:rPr>
+          <w:rFonts w:ascii="Georgia" w:hAnsi="Georgia"/>
+        </w:rPr>
+      </w:pPr>
+      <w:r>
+        <w:rPr>
+          <w:rFonts w:ascii="Georgia" w:hAnsi="Georgia"/>
           <w:b/>
           <w:bCs/>
         </w:rPr>
         <w:t>2010s:</w:t>
       </w:r>
       <w:r>
+        <w:rPr>
+          <w:rFonts w:ascii="Georgia" w:hAnsi="Georgia"/>
+        </w:rPr>
         <w:t xml:space="preserve"> Major brokerages increasingly positioned EH&amp;B around broader business outcomes, including engagement, retention, and organizational performance.</w:t>
       </w:r>
     </w:p>
@@ -133,43 +206,70 @@
           <w:ilvl w:val="0"/>
           <w:numId w:val="1"/>
         </w:numPr>
-      </w:pPr>
-      <w:r>
-        <w:rPr>
+        <w:rPr>
+          <w:rFonts w:ascii="Georgia" w:hAnsi="Georgia"/>
+        </w:rPr>
+      </w:pPr>
+      <w:r>
+        <w:rPr>
+          <w:rFonts w:ascii="Georgia" w:hAnsi="Georgia"/>
           <w:b/>
           <w:bCs/>
         </w:rPr>
         <w:t>2020 onward:</w:t>
       </w:r>
       <w:r>
+        <w:rPr>
+          <w:rFonts w:ascii="Georgia" w:hAnsi="Georgia"/>
+        </w:rPr>
         <w:t xml:space="preserve"> COVID-19 accelerated the focus on mental health, workforce resilience, and benefits as a strategic business tool.</w:t>
       </w:r>
     </w:p>
-    <w:p/>
-    <w:p>
-      <w:r>
+    <w:p>
+      <w:pPr>
+        <w:rPr>
+          <w:rFonts w:ascii="Georgia" w:hAnsi="Georgia"/>
+        </w:rPr>
+      </w:pPr>
+    </w:p>
+    <w:p>
+      <w:pPr>
+        <w:rPr>
+          <w:rFonts w:ascii="Georgia" w:hAnsi="Georgia"/>
+        </w:rPr>
+      </w:pPr>
+      <w:r>
+        <w:rPr>
+          <w:rFonts w:ascii="Georgia" w:hAnsi="Georgia"/>
+        </w:rPr>
         <w:t xml:space="preserve">The key context is that this was a </w:t>
       </w:r>
       <w:r>
         <w:rPr>
+          <w:rFonts w:ascii="Georgia" w:hAnsi="Georgia"/>
           <w:b/>
           <w:bCs/>
         </w:rPr>
         <w:t>strategic reframing of an established service—from a cost to manage into an investment in business performance</w:t>
       </w:r>
       <w:r>
+        <w:rPr>
+          <w:rFonts w:ascii="Georgia" w:hAnsi="Georgia"/>
+        </w:rPr>
         <w:t>. Another AI agent should understand both the mechanism and its limits before applying it elsewhere.</w:t>
       </w:r>
     </w:p>
     <w:p>
       <w:pPr>
         <w:rPr>
-          <w:b/>
-          <w:bCs/>
-        </w:rPr>
-      </w:pPr>
-      <w:r>
-        <w:rPr>
+          <w:rFonts w:ascii="Georgia" w:hAnsi="Georgia"/>
+          <w:b/>
+          <w:bCs/>
+        </w:rPr>
+      </w:pPr>
+      <w:r>
+        <w:rPr>
+          <w:rFonts w:ascii="Georgia" w:hAnsi="Georgia"/>
           <w:b/>
           <w:bCs/>
         </w:rPr>
@@ -182,15 +282,22 @@
           <w:ilvl w:val="0"/>
           <w:numId w:val="2"/>
         </w:numPr>
-      </w:pPr>
-      <w:r>
-        <w:rPr>
+        <w:rPr>
+          <w:rFonts w:ascii="Georgia" w:hAnsi="Georgia"/>
+        </w:rPr>
+      </w:pPr>
+      <w:r>
+        <w:rPr>
+          <w:rFonts w:ascii="Georgia" w:hAnsi="Georgia"/>
           <w:b/>
           <w:bCs/>
         </w:rPr>
         <w:t>Original framing:</w:t>
       </w:r>
       <w:r>
+        <w:rPr>
+          <w:rFonts w:ascii="Georgia" w:hAnsi="Georgia"/>
+        </w:rPr>
         <w:t xml:space="preserve"> EH&amp;B was often evaluated around premiums, coverage, compliance, and administration.</w:t>
       </w:r>
     </w:p>
@@ -200,15 +307,22 @@
           <w:ilvl w:val="0"/>
           <w:numId w:val="2"/>
         </w:numPr>
-      </w:pPr>
-      <w:r>
-        <w:rPr>
+        <w:rPr>
+          <w:rFonts w:ascii="Georgia" w:hAnsi="Georgia"/>
+        </w:rPr>
+      </w:pPr>
+      <w:r>
+        <w:rPr>
+          <w:rFonts w:ascii="Georgia" w:hAnsi="Georgia"/>
           <w:b/>
           <w:bCs/>
         </w:rPr>
         <w:t>New framing:</w:t>
       </w:r>
       <w:r>
+        <w:rPr>
+          <w:rFonts w:ascii="Georgia" w:hAnsi="Georgia"/>
+        </w:rPr>
         <w:t xml:space="preserve"> Benefits could support productivity, attendance, engagement, and retention—not merely provide insurance.</w:t>
       </w:r>
     </w:p>
@@ -218,9 +332,13 @@
           <w:ilvl w:val="0"/>
           <w:numId w:val="2"/>
         </w:numPr>
-      </w:pPr>
-      <w:r>
-        <w:rPr>
+        <w:rPr>
+          <w:rFonts w:ascii="Georgia" w:hAnsi="Georgia"/>
+        </w:rPr>
+      </w:pPr>
+      <w:r>
+        <w:rPr>
+          <w:rFonts w:ascii="Georgia" w:hAnsi="Georgia"/>
           <w:b/>
           <w:bCs/>
         </w:rPr>
@@ -228,7 +346,46 @@
         <w:t>Causal bridge:</w:t>
       </w:r>
       <w:r>
-        <w:t xml:space="preserve"> Better-designed benefits → better access to care and employee support → fewer health-related work disruptions → potential business gains.</w:t>
+        <w:rPr>
+          <w:rFonts w:ascii="Georgia" w:hAnsi="Georgia"/>
+        </w:rPr>
+        <w:t xml:space="preserve"> Better-designed benefits </w:t>
+      </w:r>
+      <w:r>
+        <w:rPr>
+          <w:rFonts w:ascii="Times New Roman" w:hAnsi="Times New Roman" w:cs="Times New Roman"/>
+        </w:rPr>
+        <w:t>→</w:t>
+      </w:r>
+      <w:r>
+        <w:rPr>
+          <w:rFonts w:ascii="Georgia" w:hAnsi="Georgia"/>
+        </w:rPr>
+        <w:t xml:space="preserve"> better access to care and employee support </w:t>
+      </w:r>
+      <w:r>
+        <w:rPr>
+          <w:rFonts w:ascii="Times New Roman" w:hAnsi="Times New Roman" w:cs="Times New Roman"/>
+        </w:rPr>
+        <w:t>→</w:t>
+      </w:r>
+      <w:r>
+        <w:rPr>
+          <w:rFonts w:ascii="Georgia" w:hAnsi="Georgia"/>
+        </w:rPr>
+        <w:t xml:space="preserve"> fewer health-related work disruptions </w:t>
+      </w:r>
+      <w:r>
+        <w:rPr>
+          <w:rFonts w:ascii="Times New Roman" w:hAnsi="Times New Roman" w:cs="Times New Roman"/>
+        </w:rPr>
+        <w:t>→</w:t>
+      </w:r>
+      <w:r>
+        <w:rPr>
+          <w:rFonts w:ascii="Georgia" w:hAnsi="Georgia"/>
+        </w:rPr>
+        <w:t xml:space="preserve"> potential business gains.</w:t>
       </w:r>
     </w:p>
     <w:p>
@@ -237,15 +394,22 @@
           <w:ilvl w:val="0"/>
           <w:numId w:val="2"/>
         </w:numPr>
-      </w:pPr>
-      <w:r>
-        <w:rPr>
+        <w:rPr>
+          <w:rFonts w:ascii="Georgia" w:hAnsi="Georgia"/>
+        </w:rPr>
+      </w:pPr>
+      <w:r>
+        <w:rPr>
+          <w:rFonts w:ascii="Georgia" w:hAnsi="Georgia"/>
           <w:b/>
           <w:bCs/>
         </w:rPr>
         <w:t>Changes behind the message:</w:t>
       </w:r>
       <w:r>
+        <w:rPr>
+          <w:rFonts w:ascii="Georgia" w:hAnsi="Georgia"/>
+        </w:rPr>
         <w:t xml:space="preserve"> This was not just new language. Brokers expanded consulting, analytics, program design, and measurement capabilities to support the broader value proposition.</w:t>
       </w:r>
     </w:p>
@@ -255,15 +419,22 @@
           <w:ilvl w:val="0"/>
           <w:numId w:val="2"/>
         </w:numPr>
-      </w:pPr>
-      <w:r>
-        <w:rPr>
+        <w:rPr>
+          <w:rFonts w:ascii="Georgia" w:hAnsi="Georgia"/>
+        </w:rPr>
+      </w:pPr>
+      <w:r>
+        <w:rPr>
+          <w:rFonts w:ascii="Georgia" w:hAnsi="Georgia"/>
           <w:b/>
           <w:bCs/>
         </w:rPr>
         <w:t>Buyer shift:</w:t>
       </w:r>
       <w:r>
+        <w:rPr>
+          <w:rFonts w:ascii="Georgia" w:hAnsi="Georgia"/>
+        </w:rPr>
         <w:t xml:space="preserve"> The conversation expanded beyond benefits procurement to HR leadership, finance, and executives concerned with workforce performance.</w:t>
       </w:r>
     </w:p>
@@ -273,27 +444,36 @@
           <w:ilvl w:val="0"/>
           <w:numId w:val="2"/>
         </w:numPr>
-      </w:pPr>
-      <w:r>
-        <w:rPr>
+        <w:rPr>
+          <w:rFonts w:ascii="Georgia" w:hAnsi="Georgia"/>
+        </w:rPr>
+      </w:pPr>
+      <w:r>
+        <w:rPr>
+          <w:rFonts w:ascii="Georgia" w:hAnsi="Georgia"/>
           <w:b/>
           <w:bCs/>
         </w:rPr>
         <w:t>Historical qualification:</w:t>
       </w:r>
       <w:r>
+        <w:rPr>
+          <w:rFonts w:ascii="Georgia" w:hAnsi="Georgia"/>
+        </w:rPr>
         <w:t xml:space="preserve"> The dates discussed earlier are approximate industry-level context, not a verified chronology for a particular firm or market.</w:t>
       </w:r>
     </w:p>
     <w:p>
       <w:pPr>
         <w:rPr>
-          <w:b/>
-          <w:bCs/>
-        </w:rPr>
-      </w:pPr>
-      <w:r>
-        <w:rPr>
+          <w:rFonts w:ascii="Georgia" w:hAnsi="Georgia"/>
+          <w:b/>
+          <w:bCs/>
+        </w:rPr>
+      </w:pPr>
+      <w:r>
+        <w:rPr>
+          <w:rFonts w:ascii="Georgia" w:hAnsi="Georgia"/>
           <w:b/>
           <w:bCs/>
         </w:rPr>
@@ -306,15 +486,22 @@
           <w:ilvl w:val="0"/>
           <w:numId w:val="3"/>
         </w:numPr>
-      </w:pPr>
-      <w:r>
-        <w:rPr>
+        <w:rPr>
+          <w:rFonts w:ascii="Georgia" w:hAnsi="Georgia"/>
+        </w:rPr>
+      </w:pPr>
+      <w:r>
+        <w:rPr>
+          <w:rFonts w:ascii="Georgia" w:hAnsi="Georgia"/>
           <w:b/>
           <w:bCs/>
         </w:rPr>
         <w:t>Identify the prevailing cost-based framing.</w:t>
       </w:r>
       <w:r>
+        <w:rPr>
+          <w:rFonts w:ascii="Georgia" w:hAnsi="Georgia"/>
+        </w:rPr>
         <w:t xml:space="preserve"> What is the service currently purchased to minimize, maintain, or comply with?</w:t>
       </w:r>
     </w:p>
@@ -324,15 +511,22 @@
           <w:ilvl w:val="0"/>
           <w:numId w:val="3"/>
         </w:numPr>
-      </w:pPr>
-      <w:r>
-        <w:rPr>
+        <w:rPr>
+          <w:rFonts w:ascii="Georgia" w:hAnsi="Georgia"/>
+        </w:rPr>
+      </w:pPr>
+      <w:r>
+        <w:rPr>
+          <w:rFonts w:ascii="Georgia" w:hAnsi="Georgia"/>
           <w:b/>
           <w:bCs/>
         </w:rPr>
         <w:t>Find a credible link to a strategic outcome.</w:t>
       </w:r>
       <w:r>
+        <w:rPr>
+          <w:rFonts w:ascii="Georgia" w:hAnsi="Georgia"/>
+        </w:rPr>
         <w:t xml:space="preserve"> Could it improve reliability, revenue, speed, retention, or risk resilience?</w:t>
       </w:r>
     </w:p>
@@ -342,15 +536,22 @@
           <w:ilvl w:val="0"/>
           <w:numId w:val="3"/>
         </w:numPr>
-      </w:pPr>
-      <w:r>
-        <w:rPr>
+        <w:rPr>
+          <w:rFonts w:ascii="Georgia" w:hAnsi="Georgia"/>
+        </w:rPr>
+      </w:pPr>
+      <w:r>
+        <w:rPr>
+          <w:rFonts w:ascii="Georgia" w:hAnsi="Georgia"/>
           <w:b/>
           <w:bCs/>
         </w:rPr>
         <w:t>Map the causal chain.</w:t>
       </w:r>
       <w:r>
+        <w:rPr>
+          <w:rFonts w:ascii="Georgia" w:hAnsi="Georgia"/>
+        </w:rPr>
         <w:t xml:space="preserve"> Explain how specific service changes could produce that outcome; avoid jumping directly from spending to ROI.</w:t>
       </w:r>
     </w:p>
@@ -360,15 +561,22 @@
           <w:ilvl w:val="0"/>
           <w:numId w:val="3"/>
         </w:numPr>
-      </w:pPr>
-      <w:r>
-        <w:rPr>
+        <w:rPr>
+          <w:rFonts w:ascii="Georgia" w:hAnsi="Georgia"/>
+        </w:rPr>
+      </w:pPr>
+      <w:r>
+        <w:rPr>
+          <w:rFonts w:ascii="Georgia" w:hAnsi="Georgia"/>
           <w:b/>
           <w:bCs/>
         </w:rPr>
         <w:t>Identify the necessary capabilities.</w:t>
       </w:r>
       <w:r>
+        <w:rPr>
+          <w:rFonts w:ascii="Georgia" w:hAnsi="Georgia"/>
+        </w:rPr>
         <w:t xml:space="preserve"> What operational improvements, expertise, or data would make the claim credible?</w:t>
       </w:r>
     </w:p>
@@ -378,15 +586,22 @@
           <w:ilvl w:val="0"/>
           <w:numId w:val="3"/>
         </w:numPr>
-      </w:pPr>
-      <w:r>
-        <w:rPr>
+        <w:rPr>
+          <w:rFonts w:ascii="Georgia" w:hAnsi="Georgia"/>
+        </w:rPr>
+      </w:pPr>
+      <w:r>
+        <w:rPr>
+          <w:rFonts w:ascii="Georgia" w:hAnsi="Georgia"/>
           <w:b/>
           <w:bCs/>
         </w:rPr>
         <w:t>Choose measures and decision-makers.</w:t>
       </w:r>
       <w:r>
+        <w:rPr>
+          <w:rFonts w:ascii="Georgia" w:hAnsi="Georgia"/>
+        </w:rPr>
         <w:t xml:space="preserve"> Match outcomes to the people accountable for them.</w:t>
       </w:r>
     </w:p>
@@ -396,63 +611,273 @@
           <w:ilvl w:val="0"/>
           <w:numId w:val="3"/>
         </w:numPr>
-      </w:pPr>
-      <w:r>
-        <w:rPr>
+        <w:rPr>
+          <w:rFonts w:ascii="Georgia" w:hAnsi="Georgia"/>
+        </w:rPr>
+      </w:pPr>
+      <w:r>
+        <w:rPr>
+          <w:rFonts w:ascii="Georgia" w:hAnsi="Georgia"/>
           <w:b/>
           <w:bCs/>
         </w:rPr>
         <w:t>Test the claim.</w:t>
       </w:r>
       <w:r>
+        <w:rPr>
+          <w:rFonts w:ascii="Georgia" w:hAnsi="Georgia"/>
+        </w:rPr>
         <w:t xml:space="preserve"> Distinguish demonstrated results from plausible benefits, accounting for costs, time lags, and alternative explanations.</w:t>
       </w:r>
     </w:p>
     <w:p>
-      <w:r>
+      <w:pPr>
+        <w:rPr>
+          <w:rFonts w:ascii="Georgia" w:hAnsi="Georgia"/>
+        </w:rPr>
+      </w:pPr>
+      <w:r>
+        <w:rPr>
+          <w:rFonts w:ascii="Georgia" w:hAnsi="Georgia"/>
+        </w:rPr>
         <w:t xml:space="preserve">For example, </w:t>
       </w:r>
       <w:r>
         <w:rPr>
+          <w:rFonts w:ascii="Georgia" w:hAnsi="Georgia"/>
           <w:b/>
           <w:bCs/>
         </w:rPr>
         <w:t>IT support</w:t>
       </w:r>
       <w:r>
+        <w:rPr>
+          <w:rFonts w:ascii="Georgia" w:hAnsi="Georgia"/>
+        </w:rPr>
         <w:t xml:space="preserve"> could be reframed from “the cost of resolving tickets” to “an investment in employee uptime”—but only if improved support demonstrably reduces disruption.</w:t>
       </w:r>
     </w:p>
     <w:p>
-      <w:r>
-        <w:rPr>
+      <w:pPr>
+        <w:rPr>
+          <w:rFonts w:ascii="Georgia" w:hAnsi="Georgia"/>
+        </w:rPr>
+      </w:pPr>
+      <w:r>
+        <w:rPr>
+          <w:rFonts w:ascii="Georgia" w:hAnsi="Georgia"/>
           <w:b/>
           <w:bCs/>
         </w:rPr>
         <w:t>Core guardrail:</w:t>
       </w:r>
       <w:r>
+        <w:rPr>
+          <w:rFonts w:ascii="Georgia" w:hAnsi="Georgia"/>
+        </w:rPr>
         <w:t xml:space="preserve"> Reframing is not proof of value. In EH&amp;B, employee well-being also has value independent of productivity, and health-data use requires privacy safeguards. An analogous application should preserve the field’s own ethical and practical constraints.</w:t>
       </w:r>
     </w:p>
     <w:p>
-      <w:r>
-        <w:rPr>
+      <w:pPr>
+        <w:rPr>
+          <w:rFonts w:ascii="Georgia" w:hAnsi="Georgia"/>
           <w:highlight w:val="yellow"/>
         </w:rPr>
-        <w:t xml:space="preserve">High speed internet is essential for employees to be as productive as possible so making their life a little bit easier and empowering them to </w:t>
-      </w:r>
-      <w:r>
-        <w:rPr>
+      </w:pPr>
+      <w:r>
+        <w:rPr>
+          <w:rFonts w:ascii="Georgia" w:hAnsi="Georgia"/>
           <w:highlight w:val="yellow"/>
         </w:rPr>
-        <w:t>succeed</w:t>
-      </w:r>
-      <w:r>
-        <w:rPr>
+        <w:t>High speed internet is essential for employees to be as productive as possible so making their life a little bit easier and empowering them to succeed is an angle we can take to win market share</w:t>
+      </w:r>
+    </w:p>
+    <w:p>
+      <w:pPr>
+        <w:spacing w:line="278" w:lineRule="auto"/>
+        <w:rPr>
+          <w:rFonts w:ascii="Georgia" w:hAnsi="Georgia"/>
+        </w:rPr>
+      </w:pPr>
+      <w:r>
+        <w:rPr>
+          <w:rFonts w:ascii="Georgia" w:hAnsi="Georgia"/>
           <w:highlight w:val="yellow"/>
         </w:rPr>
-        <w:t xml:space="preserve"> is an angle we can take to win market share</w:t>
+        <w:br w:type="page"/>
+      </w:r>
+      <w:r>
+        <w:rPr>
+          <w:rFonts w:ascii="Georgia" w:hAnsi="Georgia"/>
+          <w:b/>
+          <w:bCs/>
+        </w:rPr>
+        <w:lastRenderedPageBreak/>
+        <w:t>Kyle’s Solution</w:t>
+      </w:r>
+    </w:p>
+    <w:p>
+      <w:pPr>
+        <w:spacing w:line="278" w:lineRule="auto"/>
+        <w:rPr>
+          <w:rFonts w:ascii="Georgia" w:hAnsi="Georgia"/>
+        </w:rPr>
+      </w:pPr>
+    </w:p>
+    <w:p>
+      <w:pPr>
+        <w:spacing w:line="278" w:lineRule="auto"/>
+        <w:ind w:firstLine="720"/>
+        <w:rPr>
+          <w:rFonts w:ascii="Georgia" w:hAnsi="Georgia"/>
+        </w:rPr>
+      </w:pPr>
+      <w:r>
+        <w:rPr>
+          <w:rFonts w:ascii="Georgia" w:hAnsi="Georgia"/>
+        </w:rPr>
+        <w:t xml:space="preserve">Right now, Charter and Comcast are prioritizing individual </w:t>
+      </w:r>
+      <w:r>
+        <w:rPr>
+          <w:rFonts w:ascii="Georgia" w:hAnsi="Georgia"/>
+        </w:rPr>
+        <w:t xml:space="preserve">internet </w:t>
+      </w:r>
+      <w:r>
+        <w:rPr>
+          <w:rFonts w:ascii="Georgia" w:hAnsi="Georgia"/>
+        </w:rPr>
+        <w:t xml:space="preserve">consumers because that’s where the money is. </w:t>
+      </w:r>
+      <w:r>
+        <w:rPr>
+          <w:rFonts w:ascii="Georgia" w:hAnsi="Georgia"/>
+        </w:rPr>
+        <w:t xml:space="preserve">The EH&amp;B solution looks to solve that same goal from a different perspective by seeking to make high speed internet a corporate productivity driver and stickiness incentive. Consumers value price and reliability as the highest priorities and appreciate Spectrum having less usage fees and mostly unlimited data. However, because of price jumps and lack of transparency in the process compared to Comcast in addition to high debt preventing price matching, the strongest way to gain market share is to target the corporate side. </w:t>
+      </w:r>
+      <w:r>
+        <w:rPr>
+          <w:rFonts w:ascii="Georgia" w:hAnsi="Georgia"/>
+        </w:rPr>
+        <w:t>The underlying concern that led to the high rural investment by both the U.S. government and Charter was that there was a market need for high-speed internet that could not be filled reliably with satellites.</w:t>
+      </w:r>
+    </w:p>
+    <w:p>
+      <w:pPr>
+        <w:spacing w:line="278" w:lineRule="auto"/>
+        <w:rPr>
+          <w:rFonts w:ascii="Georgia" w:hAnsi="Georgia"/>
+        </w:rPr>
+      </w:pPr>
+      <w:r>
+        <w:rPr>
+          <w:rFonts w:ascii="Georgia" w:hAnsi="Georgia"/>
+        </w:rPr>
+        <w:tab/>
+      </w:r>
+      <w:r>
+        <w:rPr>
+          <w:rFonts w:ascii="Georgia" w:hAnsi="Georgia"/>
+        </w:rPr>
+        <w:t xml:space="preserve">54.1% of the American workforce works for large firms with over 500 employees and the top 10 EH&amp;B brokerage firms hold 44% of </w:t>
+      </w:r>
+      <w:commentRangeStart w:id="0"/>
+      <w:r>
+        <w:rPr>
+          <w:rFonts w:ascii="Georgia" w:hAnsi="Georgia"/>
+        </w:rPr>
+        <w:t>Form 5500 compensation</w:t>
+      </w:r>
+      <w:commentRangeEnd w:id="0"/>
+      <w:r>
+        <w:rPr>
+          <w:rStyle w:val="CommentReference"/>
+          <w:rFonts w:ascii="Georgia" w:hAnsi="Georgia"/>
+          <w:sz w:val="24"/>
+          <w:szCs w:val="24"/>
+        </w:rPr>
+        <w:commentReference w:id="0"/>
+      </w:r>
+      <w:r>
+        <w:rPr>
+          <w:rFonts w:ascii="Georgia" w:hAnsi="Georgia"/>
+        </w:rPr>
+        <w:t>. M</w:t>
+      </w:r>
+      <w:r>
+        <w:rPr>
+          <w:rFonts w:ascii="Georgia" w:hAnsi="Georgia"/>
+        </w:rPr>
+        <w:t xml:space="preserve">y proposed solution </w:t>
+      </w:r>
+      <w:r>
+        <w:rPr>
+          <w:rFonts w:ascii="Georgia" w:hAnsi="Georgia"/>
+        </w:rPr>
+        <w:t xml:space="preserve">would be to reframe high speed internet from a consumer-focused good to a critical success driver for corporations. </w:t>
+      </w:r>
+      <w:r>
+        <w:rPr>
+          <w:rFonts w:ascii="Georgia" w:hAnsi="Georgia"/>
+        </w:rPr>
+        <w:t xml:space="preserve">The core pitch is </w:t>
+      </w:r>
+      <w:r>
+        <w:rPr>
+          <w:rFonts w:ascii="Georgia" w:hAnsi="Georgia"/>
+        </w:rPr>
+        <w:t>“How can benefits help employees—and the company—perform better?”</w:t>
+      </w:r>
+      <w:r>
+        <w:rPr>
+          <w:rFonts w:ascii="Georgia" w:hAnsi="Georgia"/>
+        </w:rPr>
+        <w:t xml:space="preserve"> </w:t>
+      </w:r>
+      <w:r>
+        <w:rPr>
+          <w:rFonts w:ascii="Georgia" w:hAnsi="Georgia"/>
+        </w:rPr>
+        <w:t xml:space="preserve">EH&amp;B is not a new line of business. It is a different door into the same </w:t>
+      </w:r>
+      <w:commentRangeStart w:id="1"/>
+      <w:r>
+        <w:rPr>
+          <w:rFonts w:ascii="Georgia" w:hAnsi="Georgia"/>
+        </w:rPr>
+        <w:t>PSU</w:t>
+      </w:r>
+      <w:commentRangeEnd w:id="1"/>
+      <w:r>
+        <w:rPr>
+          <w:rStyle w:val="CommentReference"/>
+          <w:rFonts w:ascii="Georgia" w:hAnsi="Georgia"/>
+          <w:sz w:val="24"/>
+          <w:szCs w:val="24"/>
+        </w:rPr>
+        <w:commentReference w:id="1"/>
+      </w:r>
+      <w:r>
+        <w:rPr>
+          <w:rFonts w:ascii="Georgia" w:hAnsi="Georgia"/>
+        </w:rPr>
+        <w:t>: a billed Spectrum Internet line at the employee’s home.</w:t>
+      </w:r>
+    </w:p>
+    <w:p>
+      <w:pPr>
+        <w:spacing w:line="278" w:lineRule="auto"/>
+        <w:rPr>
+          <w:rFonts w:ascii="Georgia" w:hAnsi="Georgia"/>
+        </w:rPr>
+      </w:pPr>
+      <w:r>
+        <w:rPr>
+          <w:rFonts w:ascii="Georgia" w:hAnsi="Georgia"/>
+        </w:rPr>
+        <w:tab/>
       </w:r>
     </w:p>
     <w:sectPr>
@@ -463,6 +888,64 @@
     </w:sectPr>
   </w:body>
 </w:document>
+</file>
+
+<file path=word/comments.xml><?xml version="1.0" encoding="utf-8"?>
+<w:comments xmlns:wpc="http://schemas.microsoft.com/office/word/2010/wordprocessingCanvas" xmlns:cx="http://schemas.microsoft.com/office/drawing/2014/chartex" xmlns:cx1="http://schemas.microsoft.com/office/drawing/2015/9/8/chartex" xmlns:cx2="http://schemas.microsoft.com/office/drawing/2015/10/21/chartex" xmlns:cx3="http://schemas.microsoft.com/office/drawing/2016/5/9/chartex" xmlns:cx4="http://schemas.microsoft.com/office/drawing/2016/5/10/chartex" xmlns:cx5="http://schemas.microsoft.com/office/drawing/2016/5/11/chartex" xmlns:cx6="http://schemas.microsoft.com/office/drawing/2016/5/12/chartex" xmlns:cx7="http://schemas.microsoft.com/office/drawing/2016/5/13/chartex" xmlns:cx8="http://schemas.microsoft.com/office/drawing/2016/5/14/chartex" xmlns:mc="http://schemas.openxmlformats.org/markup-compatibility/2006" xmlns:aink="http://schemas.microsoft.com/office/drawing/2016/ink" xmlns:am3d="http://schemas.microsoft.com/office/drawing/2017/model3d" xmlns:o="urn:schemas-microsoft-com:office:office" xmlns:oel="http://schemas.microsoft.com/office/2019/extlst" xmlns:r="http://schemas.openxmlformats.org/officeDocument/2006/relationships" xmlns:m="http://schemas.openxmlformats.org/officeDocument/2006/math" xmlns:v="urn:schemas-microsoft-com:vml" xmlns:wp14="http://schemas.microsoft.com/office/word/2010/wordprocessingDrawing" xmlns:wp="http://schemas.openxmlformats.org/drawingml/2006/wordprocessingDrawing" xmlns:w10="urn:schemas-microsoft-com:office:word" xmlns:w="http://schemas.openxmlformats.org/wordprocessingml/2006/main" xmlns:w14="http://schemas.microsoft.com/office/word/2010/wordml" xmlns:w15="http://schemas.microsoft.com/office/word/2012/wordml" xmlns:w16cex="http://schemas.microsoft.com/office/word/2018/wordml/cex" xmlns:w16cid="http://schemas.microsoft.com/office/word/2016/wordml/cid" xmlns:w16="http://schemas.microsoft.com/office/word/2018/wordml" xmlns:w16du="http://schemas.microsoft.com/office/word/2023/wordml/word16du" xmlns:w16sdtdh="http://schemas.microsoft.com/office/word/2020/wordml/sdtdatahash" xmlns:w16sdtfl="http://schemas.microsoft.com/office/word/2024/wordml/sdtformatlock" xmlns:w16se="http://schemas.microsoft.com/office/word/2015/wordml/symex" xmlns:wpg="http://schemas.microsoft.com/office/word/2010/wordprocessingGroup" xmlns:wpi="http://schemas.microsoft.com/office/word/2010/wordprocessingInk" xmlns:wne="http://schemas.microsoft.com/office/word/2006/wordml" xmlns:wps="http://schemas.microsoft.com/office/word/2010/wordprocessingShape" mc:Ignorable="w14 w15 w16se w16cid w16 w16cex w16sdtdh w16sdtfl w16du wp14">
+  <w:comment w:id="0" w:author="Conger, Kyle E." w:date="2026-09-22T07:43:00Z" w:initials="KC">
+    <w:p>
+      <w:pPr>
+        <w:pStyle w:val="CommentText"/>
+      </w:pPr>
+      <w:r>
+        <w:rPr>
+          <w:rStyle w:val="CommentReference"/>
+        </w:rPr>
+        <w:annotationRef/>
+      </w:r>
+      <w:r>
+        <w:t xml:space="preserve">Form 5500 is an annual report that employers file to give the government financial and operational details about their employee benefit plans. </w:t>
+      </w:r>
+    </w:p>
+  </w:comment>
+  <w:comment w:id="1" w:author="Conger, Kyle E." w:date="2026-09-22T08:01:00Z" w:initials="KC">
+    <w:p>
+      <w:pPr>
+        <w:pStyle w:val="CommentText"/>
+      </w:pPr>
+      <w:r>
+        <w:rPr>
+          <w:rStyle w:val="CommentReference"/>
+        </w:rPr>
+        <w:annotationRef/>
+      </w:r>
+      <w:r>
+        <w:t xml:space="preserve">Primary service unit: a billed customer relationship for a product — internet, video, voice, or mobile. </w:t>
+      </w:r>
+    </w:p>
+  </w:comment>
+</w:comments>
+</file>
+
+<file path=word/commentsExtended.xml><?xml version="1.0" encoding="utf-8"?>
+<w15:commentsEx xmlns:wpc="http://schemas.microsoft.com/office/word/2010/wordprocessingCanvas" xmlns:cx="http://schemas.microsoft.com/office/drawing/2014/chartex" xmlns:cx1="http://schemas.microsoft.com/office/drawing/2015/9/8/chartex" xmlns:cx2="http://schemas.microsoft.com/office/drawing/2015/10/21/chartex" xmlns:cx3="http://schemas.microsoft.com/office/drawing/2016/5/9/chartex" xmlns:cx4="http://schemas.microsoft.com/office/drawing/2016/5/10/chartex" xmlns:cx5="http://schemas.microsoft.com/office/drawing/2016/5/11/chartex" xmlns:cx6="http://schemas.microsoft.com/office/drawing/2016/5/12/chartex" xmlns:cx7="http://schemas.microsoft.com/office/drawing/2016/5/13/chartex" xmlns:cx8="http://schemas.microsoft.com/office/drawing/2016/5/14/chartex" xmlns:mc="http://schemas.openxmlformats.org/markup-compatibility/2006" xmlns:aink="http://schemas.microsoft.com/office/drawing/2016/ink" xmlns:am3d="http://schemas.microsoft.com/office/drawing/2017/model3d" xmlns:o="urn:schemas-microsoft-com:office:office" xmlns:oel="http://schemas.microsoft.com/office/2019/extlst" xmlns:r="http://schemas.openxmlformats.org/officeDocument/2006/relationships" xmlns:m="http://schemas.openxmlformats.org/officeDocument/2006/math" xmlns:v="urn:schemas-microsoft-com:vml" xmlns:wp14="http://schemas.microsoft.com/office/word/2010/wordprocessingDrawing" xmlns:wp="http://schemas.openxmlformats.org/drawingml/2006/wordprocessingDrawing" xmlns:w10="urn:schemas-microsoft-com:office:word" xmlns:w="http://schemas.openxmlformats.org/wordprocessingml/2006/main" xmlns:w14="http://schemas.microsoft.com/office/word/2010/wordml" xmlns:w15="http://schemas.microsoft.com/office/word/2012/wordml" xmlns:w16cex="http://schemas.microsoft.com/office/word/2018/wordml/cex" xmlns:w16cid="http://schemas.microsoft.com/office/word/2016/wordml/cid" xmlns:w16="http://schemas.microsoft.com/office/word/2018/wordml" xmlns:w16du="http://schemas.microsoft.com/office/word/2023/wordml/word16du" xmlns:w16sdtdh="http://schemas.microsoft.com/office/word/2020/wordml/sdtdatahash" xmlns:w16sdtfl="http://schemas.microsoft.com/office/word/2024/wordml/sdtformatlock" xmlns:w16se="http://schemas.microsoft.com/office/word/2015/wordml/symex" xmlns:wpg="http://schemas.microsoft.com/office/word/2010/wordprocessingGroup" xmlns:wpi="http://schemas.microsoft.com/office/word/2010/wordprocessingInk" xmlns:wne="http://schemas.microsoft.com/office/word/2006/wordml" xmlns:wps="http://schemas.microsoft.com/office/word/2010/wordprocessingShape" mc:Ignorable="w14 w15 w16se w16cid w16 w16cex w16sdtdh w16sdtfl w16du wp14">
+  <w15:commentEx w15:paraId="122E1C2B" w15:done="0"/>
+  <w15:commentEx w15:paraId="58984A82" w15:done="0"/>
+</w15:commentsEx>
+</file>
+
+<file path=word/commentsExtensible.xml><?xml version="1.0" encoding="utf-8"?>
+<w16cex:commentsExtensible xmlns:wpc="http://schemas.microsoft.com/office/word/2010/wordprocessingCanvas" xmlns:cx="http://schemas.microsoft.com/office/drawing/2014/chartex" xmlns:cx1="http://schemas.microsoft.com/office/drawing/2015/9/8/chartex" xmlns:cx2="http://schemas.microsoft.com/office/drawing/2015/10/21/chartex" xmlns:cx3="http://schemas.microsoft.com/office/drawing/2016/5/9/chartex" xmlns:cx4="http://schemas.microsoft.com/office/drawing/2016/5/10/chartex" xmlns:cx5="http://schemas.microsoft.com/office/drawing/2016/5/11/chartex" xmlns:cx6="http://schemas.microsoft.com/office/drawing/2016/5/12/chartex" xmlns:cx7="http://schemas.microsoft.com/office/drawing/2016/5/13/chartex" xmlns:cx8="http://schemas.microsoft.com/office/drawing/2016/5/14/chartex" xmlns:cr="http://schemas.microsoft.com/office/comments/2020/reactions" xmlns:mc="http://schemas.openxmlformats.org/markup-compatibility/2006" xmlns:aink="http://schemas.microsoft.com/office/drawing/2016/ink" xmlns:am3d="http://schemas.microsoft.com/office/drawing/2017/model3d" xmlns:o="urn:schemas-microsoft-com:office:office" xmlns:oel="http://schemas.microsoft.com/office/2019/extlst" xmlns:r="http://schemas.openxmlformats.org/officeDocument/2006/relationships" xmlns:m="http://schemas.openxmlformats.org/officeDocument/2006/math" xmlns:v="urn:schemas-microsoft-com:vml" xmlns:wp14="http://schemas.microsoft.com/office/word/2010/wordprocessingDrawing" xmlns:wp="http://schemas.openxmlformats.org/drawingml/2006/wordprocessingDrawing" xmlns:w10="urn:schemas-microsoft-com:office:word" xmlns:w="http://schemas.openxmlformats.org/wordprocessingml/2006/main" xmlns:w14="http://schemas.microsoft.com/office/word/2010/wordml" xmlns:w15="http://schemas.microsoft.com/office/word/2012/wordml" xmlns:w16cex="http://schemas.microsoft.com/office/word/2018/wordml/cex" xmlns:w16cid="http://schemas.microsoft.com/office/word/2016/wordml/cid" xmlns:w16="http://schemas.microsoft.com/office/word/2018/wordml" xmlns:w16du="http://schemas.microsoft.com/office/word/2023/wordml/word16du" xmlns:w16sdtdh="http://schemas.microsoft.com/office/word/2020/wordml/sdtdatahash" xmlns:w16sdtfl="http://schemas.microsoft.com/office/word/2024/wordml/sdtformatlock" xmlns:w16se="http://schemas.microsoft.com/office/word/2015/wordml/symex" xmlns:wpg="http://schemas.microsoft.com/office/word/2010/wordprocessingGroup" xmlns:wpi="http://schemas.microsoft.com/office/word/2010/wordprocessingInk" xmlns:wne="http://schemas.microsoft.com/office/word/2006/wordml" xmlns:wps="http://schemas.microsoft.com/office/word/2010/wordprocessingShape" mc:Ignorable="w14 w15 w16se w16cid w16 w16cex w16sdtdh w16sdtfl cr w16du wp14">
+  <w16cex:commentExtensible w16cex:durableId="4152921E" w16cex:dateUtc="2026-09-22T11:43:00Z"/>
+  <w16cex:commentExtensible w16cex:durableId="26A780EB" w16cex:dateUtc="2026-09-22T12:01:00Z"/>
+</w16cex:commentsExtensible>
+</file>
+
+<file path=word/commentsIds.xml><?xml version="1.0" encoding="utf-8"?>
+<w16cid:commentsIds xmlns:wpc="http://schemas.microsoft.com/office/word/2010/wordprocessingCanvas" xmlns:cx="http://schemas.microsoft.com/office/drawing/2014/chartex" xmlns:cx1="http://schemas.microsoft.com/office/drawing/2015/9/8/chartex" xmlns:cx2="http://schemas.microsoft.com/office/drawing/2015/10/21/chartex" xmlns:cx3="http://schemas.microsoft.com/office/drawing/2016/5/9/chartex" xmlns:cx4="http://schemas.microsoft.com/office/drawing/2016/5/10/chartex" xmlns:cx5="http://schemas.microsoft.com/office/drawing/2016/5/11/chartex" xmlns:cx6="http://schemas.microsoft.com/office/drawing/2016/5/12/chartex" xmlns:cx7="http://schemas.microsoft.com/office/drawing/2016/5/13/chartex" xmlns:cx8="http://schemas.microsoft.com/office/drawing/2016/5/14/chartex" xmlns:mc="http://schemas.openxmlformats.org/markup-compatibility/2006" xmlns:aink="http://schemas.microsoft.com/office/drawing/2016/ink" xmlns:am3d="http://schemas.microsoft.com/office/drawing/2017/model3d" xmlns:o="urn:schemas-microsoft-com:office:office" xmlns:oel="http://schemas.microsoft.com/office/2019/extlst" xmlns:r="http://schemas.openxmlformats.org/officeDocument/2006/relationships" xmlns:m="http://schemas.openxmlformats.org/officeDocument/2006/math" xmlns:v="urn:schemas-microsoft-com:vml" xmlns:wp14="http://schemas.microsoft.com/office/word/2010/wordprocessingDrawing" xmlns:wp="http://schemas.openxmlformats.org/drawingml/2006/wordprocessingDrawing" xmlns:w10="urn:schemas-microsoft-com:office:word" xmlns:w="http://schemas.openxmlformats.org/wordprocessingml/2006/main" xmlns:w14="http://schemas.microsoft.com/office/word/2010/wordml" xmlns:w15="http://schemas.microsoft.com/office/word/2012/wordml" xmlns:w16cex="http://schemas.microsoft.com/office/word/2018/wordml/cex" xmlns:w16cid="http://schemas.microsoft.com/office/word/2016/wordml/cid" xmlns:w16="http://schemas.microsoft.com/office/word/2018/wordml" xmlns:w16du="http://schemas.microsoft.com/office/word/2023/wordml/word16du" xmlns:w16sdtdh="http://schemas.microsoft.com/office/word/2020/wordml/sdtdatahash" xmlns:w16sdtfl="http://schemas.microsoft.com/office/word/2024/wordml/sdtformatlock" xmlns:w16se="http://schemas.microsoft.com/office/word/2015/wordml/symex" xmlns:wpg="http://schemas.microsoft.com/office/word/2010/wordprocessingGroup" xmlns:wpi="http://schemas.microsoft.com/office/word/2010/wordprocessingInk" xmlns:wne="http://schemas.microsoft.com/office/word/2006/wordml" xmlns:wps="http://schemas.microsoft.com/office/word/2010/wordprocessingShape" mc:Ignorable="w14 w15 w16se w16cid w16 w16cex w16sdtdh w16sdtfl w16du wp14">
+  <w16cid:commentId w16cid:paraId="122E1C2B" w16cid:durableId="4152921E"/>
+  <w16cid:commentId w16cid:paraId="58984A82" w16cid:durableId="26A780EB"/>
+</w16cid:commentsIds>
 </file>
 
 <file path=word/numbering.xml><?xml version="1.0" encoding="utf-8"?>
@@ -888,6 +1371,14 @@
     <w:abstractNumId w:val="2"/>
   </w:num>
 </w:numbering>
+</file>
+
+<file path=word/people.xml><?xml version="1.0" encoding="utf-8"?>
+<w15:people xmlns:wpc="http://schemas.microsoft.com/office/word/2010/wordprocessingCanvas" xmlns:cx="http://schemas.microsoft.com/office/drawing/2014/chartex" xmlns:cx1="http://schemas.microsoft.com/office/drawing/2015/9/8/chartex" xmlns:cx2="http://schemas.microsoft.com/office/drawing/2015/10/21/chartex" xmlns:cx3="http://schemas.microsoft.com/office/drawing/2016/5/9/chartex" xmlns:cx4="http://schemas.microsoft.com/office/drawing/2016/5/10/chartex" xmlns:cx5="http://schemas.microsoft.com/office/drawing/2016/5/11/chartex" xmlns:cx6="http://schemas.microsoft.com/office/drawing/2016/5/12/chartex" xmlns:cx7="http://schemas.microsoft.com/office/drawing/2016/5/13/chartex" xmlns:cx8="http://schemas.microsoft.com/office/drawing/2016/5/14/chartex" xmlns:mc="http://schemas.openxmlformats.org/markup-compatibility/2006" xmlns:aink="http://schemas.microsoft.com/office/drawing/2016/ink" xmlns:am3d="http://schemas.microsoft.com/office/drawing/2017/model3d" xmlns:o="urn:schemas-microsoft-com:office:office" xmlns:oel="http://schemas.microsoft.com/office/2019/extlst" xmlns:r="http://schemas.openxmlformats.org/officeDocument/2006/relationships" xmlns:m="http://schemas.openxmlformats.org/officeDocument/2006/math" xmlns:v="urn:schemas-microsoft-com:vml" xmlns:wp14="http://schemas.microsoft.com/office/word/2010/wordprocessingDrawing" xmlns:wp="http://schemas.openxmlformats.org/drawingml/2006/wordprocessingDrawing" xmlns:w10="urn:schemas-microsoft-com:office:word" xmlns:w="http://schemas.openxmlformats.org/wordprocessingml/2006/main" xmlns:w14="http://schemas.microsoft.com/office/word/2010/wordml" xmlns:w15="http://schemas.microsoft.com/office/word/2012/wordml" xmlns:w16cex="http://schemas.microsoft.com/office/word/2018/wordml/cex" xmlns:w16cid="http://schemas.microsoft.com/office/word/2016/wordml/cid" xmlns:w16="http://schemas.microsoft.com/office/word/2018/wordml" xmlns:w16du="http://schemas.microsoft.com/office/word/2023/wordml/word16du" xmlns:w16sdtdh="http://schemas.microsoft.com/office/word/2020/wordml/sdtdatahash" xmlns:w16sdtfl="http://schemas.microsoft.com/office/word/2024/wordml/sdtformatlock" xmlns:w16se="http://schemas.microsoft.com/office/word/2015/wordml/symex" xmlns:wpg="http://schemas.microsoft.com/office/word/2010/wordprocessingGroup" xmlns:wpi="http://schemas.microsoft.com/office/word/2010/wordprocessingInk" xmlns:wne="http://schemas.microsoft.com/office/word/2006/wordml" xmlns:wps="http://schemas.microsoft.com/office/word/2010/wordprocessingShape" mc:Ignorable="w14 w15 w16se w16cid w16 w16cex w16sdtdh w16sdtfl w16du wp14">
+  <w15:person w15:author="Conger, Kyle E.">
+    <w15:presenceInfo w15:providerId="AD" w15:userId="S::kyle.conger@ufl.edu::dd654b26-270a-4e81-bd47-ad4326746d76"/>
+  </w15:person>
+</w15:people>
 </file>
 
 <file path=word/styles.xml><?xml version="1.0" encoding="utf-8"?>
@@ -1810,6 +2301,72 @@
       <w:spacing w:val="5"/>
     </w:rPr>
   </w:style>
+  <w:style w:type="character" w:styleId="CommentReference">
+    <w:name w:val="annotation reference"/>
+    <w:basedOn w:val="DefaultParagraphFont"/>
+    <w:uiPriority w:val="99"/>
+    <w:semiHidden/>
+    <w:unhideWhenUsed/>
+    <w:rsid w:val="00AA05E3"/>
+    <w:rPr>
+      <w:sz w:val="16"/>
+      <w:szCs w:val="16"/>
+    </w:rPr>
+  </w:style>
+  <w:style w:type="paragraph" w:styleId="CommentText">
+    <w:name w:val="annotation text"/>
+    <w:basedOn w:val="Normal"/>
+    <w:link w:val="CommentTextChar"/>
+    <w:uiPriority w:val="99"/>
+    <w:unhideWhenUsed/>
+    <w:rsid w:val="00AA05E3"/>
+    <w:pPr>
+      <w:spacing w:line="240" w:lineRule="auto"/>
+    </w:pPr>
+    <w:rPr>
+      <w:sz w:val="20"/>
+      <w:szCs w:val="20"/>
+    </w:rPr>
+  </w:style>
+  <w:style w:type="character" w:customStyle="1" w:styleId="CommentTextChar">
+    <w:name w:val="Comment Text Char"/>
+    <w:basedOn w:val="DefaultParagraphFont"/>
+    <w:link w:val="CommentText"/>
+    <w:uiPriority w:val="99"/>
+    <w:rsid w:val="00AA05E3"/>
+    <w:rPr>
+      <w:sz w:val="20"/>
+      <w:szCs w:val="20"/>
+    </w:rPr>
+  </w:style>
+  <w:style w:type="paragraph" w:styleId="CommentSubject">
+    <w:name w:val="annotation subject"/>
+    <w:basedOn w:val="CommentText"/>
+    <w:next w:val="CommentText"/>
+    <w:link w:val="CommentSubjectChar"/>
+    <w:uiPriority w:val="99"/>
+    <w:semiHidden/>
+    <w:unhideWhenUsed/>
+    <w:rsid w:val="00AA05E3"/>
+    <w:rPr>
+      <w:b/>
+      <w:bCs/>
+    </w:rPr>
+  </w:style>
+  <w:style w:type="character" w:customStyle="1" w:styleId="CommentSubjectChar">
+    <w:name w:val="Comment Subject Char"/>
+    <w:basedOn w:val="CommentTextChar"/>
+    <w:link w:val="CommentSubject"/>
+    <w:uiPriority w:val="99"/>
+    <w:semiHidden/>
+    <w:rsid w:val="00AA05E3"/>
+    <w:rPr>
+      <w:b/>
+      <w:bCs/>
+      <w:sz w:val="20"/>
+      <w:szCs w:val="20"/>
+    </w:rPr>
+  </w:style>
 </w:styles>
 </file>
 

</xml_diff>